<commit_message>
feat: update report with detailed scenarios and solutions for transaction isolation issues including Lost Update, Dirty Read, Non-repeatable Read, Phantom Read, and Deadlock
</commit_message>
<xml_diff>
--- a/05_Docs/Report_Group3.docx
+++ b/05_Docs/Report_Group3.docx
@@ -3907,19 +3907,7 @@
       </w:pPr>
       <w:r>
         <w:lastRenderedPageBreak/>
-        <w:t xml:space="preserve">Thiết kế ERD chuẩn 3NF với </w:t>
-      </w:r>
-      <w:r>
-        <w:t>15 thực thể, 18 quan hệ</w:t>
-      </w:r>
-      <w:r>
-        <w:t xml:space="preserve">, xử lý đúng vòng phụ thuộc khóa ngoại </w:t>
-      </w:r>
-      <w:r>
-        <w:t>giữa</w:t>
-      </w:r>
-      <w:r>
-        <w:t xml:space="preserve"> PhongBan và NhanVien.</w:t>
+        <w:t>Thiết kế ERD chuẩn 3NF với 15 thực thể, 18 quan hệ, xử lý đúng vòng phụ thuộc khóa ngoại giữa PhongBan và NhanVien.</w:t>
       </w:r>
     </w:p>
     <w:p>
@@ -4022,6 +4010,8 @@
       <w:r>
         <w:t>Tạo các báo cáo pháp lý: D02-TS (BHXH), mẫu 05/KK-TNCN (quyết toán thuế).</w:t>
       </w:r>
+      <w:bookmarkStart w:id="12" w:name="_GoBack"/>
+      <w:bookmarkEnd w:id="12"/>
     </w:p>
     <w:p>
       <w:pPr>
@@ -4035,11 +4025,11 @@
       <w:pPr>
         <w:pStyle w:val="Heading3"/>
       </w:pPr>
-      <w:bookmarkStart w:id="12" w:name="_Toc232971133"/>
+      <w:bookmarkStart w:id="13" w:name="_Toc232971133"/>
       <w:r>
         <w:t>1.3.2 Phạm vi không bao gồm</w:t>
       </w:r>
-      <w:bookmarkEnd w:id="12"/>
+      <w:bookmarkEnd w:id="13"/>
     </w:p>
     <w:p>
       <w:pPr>
@@ -4079,11 +4069,11 @@
         <w:pStyle w:val="Heading2"/>
         <w:spacing w:line="360" w:lineRule="auto"/>
       </w:pPr>
-      <w:bookmarkStart w:id="13" w:name="_Toc232971134"/>
+      <w:bookmarkStart w:id="14" w:name="_Toc232971134"/>
       <w:r>
         <w:t>1.4 Phương pháp thực hiện</w:t>
       </w:r>
-      <w:bookmarkEnd w:id="13"/>
+      <w:bookmarkEnd w:id="14"/>
     </w:p>
     <w:p>
       <w:pPr>
@@ -4138,11 +4128,11 @@
         <w:pStyle w:val="Heading2"/>
         <w:spacing w:line="360" w:lineRule="auto"/>
       </w:pPr>
-      <w:bookmarkStart w:id="14" w:name="_Toc232971135"/>
+      <w:bookmarkStart w:id="15" w:name="_Toc232971135"/>
       <w:r>
         <w:t>1.5 Cấu trúc báo cáo</w:t>
       </w:r>
-      <w:bookmarkEnd w:id="14"/>
+      <w:bookmarkEnd w:id="15"/>
     </w:p>
     <w:p>
       <w:pPr>
@@ -4226,6 +4216,7 @@
         <w:pStyle w:val="ListParagraph"/>
       </w:pPr>
       <w:r>
+        <w:lastRenderedPageBreak/>
         <w:t xml:space="preserve">Chương 5: Kiểm thử và đánh giá kết quả </w:t>
       </w:r>
       <w:r>
@@ -4243,7 +4234,6 @@
         <w:spacing w:line="360" w:lineRule="auto"/>
       </w:pPr>
       <w:r>
-        <w:lastRenderedPageBreak/>
         <w:br w:type="page"/>
       </w:r>
     </w:p>
@@ -4252,33 +4242,33 @@
         <w:pStyle w:val="Heading1"/>
         <w:spacing w:line="360" w:lineRule="auto"/>
       </w:pPr>
-      <w:bookmarkStart w:id="15" w:name="_Toc232971136"/>
+      <w:bookmarkStart w:id="16" w:name="_Toc232971136"/>
       <w:r>
         <w:lastRenderedPageBreak/>
         <w:t>CHƯƠNG 2: PHÂN TÍCH VÀ THIẾT KẾ HỆ THỐNG</w:t>
       </w:r>
-      <w:bookmarkEnd w:id="15"/>
+      <w:bookmarkEnd w:id="16"/>
     </w:p>
     <w:p>
       <w:pPr>
         <w:pStyle w:val="Heading2"/>
         <w:spacing w:line="360" w:lineRule="auto"/>
       </w:pPr>
-      <w:bookmarkStart w:id="16" w:name="_Toc232971137"/>
+      <w:bookmarkStart w:id="17" w:name="_Toc232971137"/>
       <w:r>
         <w:t>2.1 Phân tích yêu cầu hệ thống</w:t>
       </w:r>
-      <w:bookmarkEnd w:id="16"/>
+      <w:bookmarkEnd w:id="17"/>
     </w:p>
     <w:p>
       <w:pPr>
         <w:pStyle w:val="Heading3"/>
       </w:pPr>
-      <w:bookmarkStart w:id="17" w:name="_Toc232971138"/>
+      <w:bookmarkStart w:id="18" w:name="_Toc232971138"/>
       <w:r>
         <w:t>2.1.1 Quy trình nghiệp vụ nhân sự</w:t>
       </w:r>
-      <w:bookmarkEnd w:id="17"/>
+      <w:bookmarkEnd w:id="18"/>
     </w:p>
     <w:p>
       <w:pPr>
@@ -4334,11 +4324,11 @@
       <w:pPr>
         <w:pStyle w:val="Heading3"/>
       </w:pPr>
-      <w:bookmarkStart w:id="18" w:name="_Toc232971139"/>
+      <w:bookmarkStart w:id="19" w:name="_Toc232971139"/>
       <w:r>
         <w:t>2.1.2 Yêu cầu chức năng</w:t>
       </w:r>
-      <w:bookmarkEnd w:id="18"/>
+      <w:bookmarkEnd w:id="19"/>
     </w:p>
     <w:p>
       <w:pPr>
@@ -5234,11 +5224,11 @@
       <w:pPr>
         <w:pStyle w:val="Heading3"/>
       </w:pPr>
-      <w:bookmarkStart w:id="19" w:name="_Toc232971140"/>
+      <w:bookmarkStart w:id="20" w:name="_Toc232971140"/>
       <w:r>
         <w:t>2.1.3 Yêu cầu phi chức năng</w:t>
       </w:r>
-      <w:bookmarkEnd w:id="19"/>
+      <w:bookmarkEnd w:id="20"/>
     </w:p>
     <w:p>
       <w:pPr>
@@ -5299,21 +5289,21 @@
         <w:pStyle w:val="Heading2"/>
         <w:spacing w:line="360" w:lineRule="auto"/>
       </w:pPr>
-      <w:bookmarkStart w:id="20" w:name="_Toc232971141"/>
+      <w:bookmarkStart w:id="21" w:name="_Toc232971141"/>
       <w:r>
         <w:t>2.2 Thiết kế cơ sở dữ liệu</w:t>
       </w:r>
-      <w:bookmarkEnd w:id="20"/>
+      <w:bookmarkEnd w:id="21"/>
     </w:p>
     <w:p>
       <w:pPr>
         <w:pStyle w:val="Heading3"/>
       </w:pPr>
-      <w:bookmarkStart w:id="21" w:name="_Toc232971142"/>
+      <w:bookmarkStart w:id="22" w:name="_Toc232971142"/>
       <w:r>
         <w:t>2.2.1 Sơ đồ thực thể quan hệ (ERD)</w:t>
       </w:r>
-      <w:bookmarkEnd w:id="21"/>
+      <w:bookmarkEnd w:id="22"/>
     </w:p>
     <w:p>
       <w:pPr>
@@ -5351,7 +5341,7 @@
           <w:noProof/>
         </w:rPr>
         <w:drawing>
-          <wp:inline distT="0" distB="0" distL="0" distR="0">
+          <wp:inline distT="0" distB="0" distL="0" distR="0" wp14:anchorId="2C851AEE" wp14:editId="0966E598">
             <wp:extent cx="5760085" cy="6275070"/>
             <wp:effectExtent l="0" t="0" r="0" b="0"/>
             <wp:docPr id="3" name="Picture 3"/>
@@ -5418,8 +5408,6 @@
       <w:r>
         <w:t>Các thực thể được phân loại thành 5 nhóm theo chức năng:</w:t>
       </w:r>
-      <w:bookmarkStart w:id="22" w:name="_GoBack"/>
-      <w:bookmarkEnd w:id="22"/>
     </w:p>
     <w:p>
       <w:pPr>
@@ -7126,7 +7114,7 @@
           <w:noProof/>
         </w:rPr>
         <w:drawing>
-          <wp:inline distT="0" distB="0" distL="0" distR="0" wp14:anchorId="0597DAA7" wp14:editId="48B6B8F5">
+          <wp:inline distT="0" distB="0" distL="0" distR="0" wp14:anchorId="4B82B67C" wp14:editId="709F8AB6">
             <wp:extent cx="5760085" cy="3238500"/>
             <wp:effectExtent l="0" t="0" r="0" b="0"/>
             <wp:docPr id="5" name="Picture 5"/>
@@ -17581,6 +17569,7 @@
         <w:pStyle w:val="ListParagraph"/>
       </w:pPr>
       <w:r>
+        <w:lastRenderedPageBreak/>
         <w:t>innodb_deadlock_detect = ON: InnoDB tự phát hiện và phá vỡ deadlock, chọn victim có ít undo log nhất.</w:t>
       </w:r>
     </w:p>
@@ -17589,7 +17578,6 @@
         <w:pStyle w:val="ListParagraph"/>
       </w:pPr>
       <w:r>
-        <w:lastRenderedPageBreak/>
         <w:t>innodb_lock_wait_timeout = 50: Timeout 50 giây. Nếu deadlock detect thất bại, giao tác chờ quá 50s tự bị hủy.</w:t>
       </w:r>
     </w:p>
@@ -23438,13 +23426,126 @@
     </w:lvl>
   </w:abstractNum>
   <w:abstractNum w:abstractNumId="4" w15:restartNumberingAfterBreak="0">
+    <w:nsid w:val="2F3E08AF"/>
+    <w:multiLevelType w:val="hybridMultilevel"/>
+    <w:tmpl w:val="25548668"/>
+    <w:lvl w:ilvl="0" w:tplc="AA1EC7E2">
+      <w:start w:val="1"/>
+      <w:numFmt w:val="bullet"/>
+      <w:pStyle w:val="ListParagraph"/>
+      <w:lvlText w:val=""/>
+      <w:lvlJc w:val="left"/>
+      <w:pPr>
+        <w:ind w:left="1440" w:hanging="360"/>
+      </w:pPr>
+      <w:rPr>
+        <w:rFonts w:ascii="Symbol" w:hAnsi="Symbol" w:hint="default"/>
+      </w:rPr>
+    </w:lvl>
+    <w:lvl w:ilvl="1" w:tplc="04090003" w:tentative="1">
+      <w:start w:val="1"/>
+      <w:numFmt w:val="bullet"/>
+      <w:lvlText w:val="o"/>
+      <w:lvlJc w:val="left"/>
+      <w:pPr>
+        <w:ind w:left="2160" w:hanging="360"/>
+      </w:pPr>
+      <w:rPr>
+        <w:rFonts w:ascii="Courier New" w:hAnsi="Courier New" w:cs="Courier New" w:hint="default"/>
+      </w:rPr>
+    </w:lvl>
+    <w:lvl w:ilvl="2" w:tplc="04090005" w:tentative="1">
+      <w:start w:val="1"/>
+      <w:numFmt w:val="bullet"/>
+      <w:lvlText w:val=""/>
+      <w:lvlJc w:val="left"/>
+      <w:pPr>
+        <w:ind w:left="2880" w:hanging="360"/>
+      </w:pPr>
+      <w:rPr>
+        <w:rFonts w:ascii="Wingdings" w:hAnsi="Wingdings" w:hint="default"/>
+      </w:rPr>
+    </w:lvl>
+    <w:lvl w:ilvl="3" w:tplc="04090001" w:tentative="1">
+      <w:start w:val="1"/>
+      <w:numFmt w:val="bullet"/>
+      <w:lvlText w:val=""/>
+      <w:lvlJc w:val="left"/>
+      <w:pPr>
+        <w:ind w:left="3600" w:hanging="360"/>
+      </w:pPr>
+      <w:rPr>
+        <w:rFonts w:ascii="Symbol" w:hAnsi="Symbol" w:hint="default"/>
+      </w:rPr>
+    </w:lvl>
+    <w:lvl w:ilvl="4" w:tplc="04090003" w:tentative="1">
+      <w:start w:val="1"/>
+      <w:numFmt w:val="bullet"/>
+      <w:lvlText w:val="o"/>
+      <w:lvlJc w:val="left"/>
+      <w:pPr>
+        <w:ind w:left="4320" w:hanging="360"/>
+      </w:pPr>
+      <w:rPr>
+        <w:rFonts w:ascii="Courier New" w:hAnsi="Courier New" w:cs="Courier New" w:hint="default"/>
+      </w:rPr>
+    </w:lvl>
+    <w:lvl w:ilvl="5" w:tplc="04090005" w:tentative="1">
+      <w:start w:val="1"/>
+      <w:numFmt w:val="bullet"/>
+      <w:lvlText w:val=""/>
+      <w:lvlJc w:val="left"/>
+      <w:pPr>
+        <w:ind w:left="5040" w:hanging="360"/>
+      </w:pPr>
+      <w:rPr>
+        <w:rFonts w:ascii="Wingdings" w:hAnsi="Wingdings" w:hint="default"/>
+      </w:rPr>
+    </w:lvl>
+    <w:lvl w:ilvl="6" w:tplc="04090001" w:tentative="1">
+      <w:start w:val="1"/>
+      <w:numFmt w:val="bullet"/>
+      <w:lvlText w:val=""/>
+      <w:lvlJc w:val="left"/>
+      <w:pPr>
+        <w:ind w:left="5760" w:hanging="360"/>
+      </w:pPr>
+      <w:rPr>
+        <w:rFonts w:ascii="Symbol" w:hAnsi="Symbol" w:hint="default"/>
+      </w:rPr>
+    </w:lvl>
+    <w:lvl w:ilvl="7" w:tplc="04090003" w:tentative="1">
+      <w:start w:val="1"/>
+      <w:numFmt w:val="bullet"/>
+      <w:lvlText w:val="o"/>
+      <w:lvlJc w:val="left"/>
+      <w:pPr>
+        <w:ind w:left="6480" w:hanging="360"/>
+      </w:pPr>
+      <w:rPr>
+        <w:rFonts w:ascii="Courier New" w:hAnsi="Courier New" w:cs="Courier New" w:hint="default"/>
+      </w:rPr>
+    </w:lvl>
+    <w:lvl w:ilvl="8" w:tplc="04090005" w:tentative="1">
+      <w:start w:val="1"/>
+      <w:numFmt w:val="bullet"/>
+      <w:lvlText w:val=""/>
+      <w:lvlJc w:val="left"/>
+      <w:pPr>
+        <w:ind w:left="7200" w:hanging="360"/>
+      </w:pPr>
+      <w:rPr>
+        <w:rFonts w:ascii="Wingdings" w:hAnsi="Wingdings" w:hint="default"/>
+      </w:rPr>
+    </w:lvl>
+  </w:abstractNum>
+  <w:abstractNum w:abstractNumId="5" w15:restartNumberingAfterBreak="0">
     <w:nsid w:val="3AE469DA"/>
     <w:multiLevelType w:val="hybridMultilevel"/>
     <w:tmpl w:val="88C0D774"/>
     <w:lvl w:ilvl="0" w:tplc="04090001">
       <w:start w:val="1"/>
       <w:numFmt w:val="bullet"/>
-      <w:pStyle w:val="ListParagraph"/>
       <w:lvlText w:val=""/>
       <w:lvlJc w:val="left"/>
       <w:pPr>
@@ -23605,7 +23706,7 @@
       </w:rPr>
     </w:lvl>
   </w:abstractNum>
-  <w:abstractNum w:abstractNumId="5" w15:restartNumberingAfterBreak="0">
+  <w:abstractNum w:abstractNumId="6" w15:restartNumberingAfterBreak="0">
     <w:nsid w:val="4EEB51B4"/>
     <w:multiLevelType w:val="hybridMultilevel"/>
     <w:tmpl w:val="D518729C"/>
@@ -23666,7 +23767,7 @@
     </w:lvlOverride>
   </w:num>
   <w:num w:numId="2">
-    <w:abstractNumId w:val="5"/>
+    <w:abstractNumId w:val="6"/>
     <w:lvlOverride w:ilvl="0">
       <w:startOverride w:val="1"/>
     </w:lvlOverride>
@@ -23675,12 +23776,15 @@
     <w:abstractNumId w:val="1"/>
   </w:num>
   <w:num w:numId="4">
-    <w:abstractNumId w:val="5"/>
+    <w:abstractNumId w:val="6"/>
   </w:num>
   <w:num w:numId="5">
     <w:abstractNumId w:val="2"/>
   </w:num>
   <w:num w:numId="6">
+    <w:abstractNumId w:val="5"/>
+  </w:num>
+  <w:num w:numId="7">
     <w:abstractNumId w:val="4"/>
   </w:num>
 </w:numbering>
@@ -24212,12 +24316,13 @@
   <w:style w:type="paragraph" w:styleId="ListParagraph">
     <w:name w:val="List Paragraph"/>
     <w:qFormat/>
-    <w:rsid w:val="009E7D76"/>
+    <w:rsid w:val="00703E40"/>
     <w:pPr>
       <w:numPr>
-        <w:numId w:val="6"/>
+        <w:numId w:val="7"/>
       </w:numPr>
       <w:spacing w:after="80" w:line="360" w:lineRule="auto"/>
+      <w:ind w:left="1134"/>
       <w:jc w:val="both"/>
     </w:pPr>
   </w:style>
@@ -24737,7 +24842,7 @@
 </file>
 
 <file path=customXml/itemProps1.xml><?xml version="1.0" encoding="utf-8"?>
-<ds:datastoreItem xmlns:ds="http://schemas.openxmlformats.org/officeDocument/2006/customXml" ds:itemID="{18E5108B-A296-4AA1-AAF4-DE18D2D11E7B}">
+<ds:datastoreItem xmlns:ds="http://schemas.openxmlformats.org/officeDocument/2006/customXml" ds:itemID="{B5202C57-4C54-47CE-9780-4EFCBDC00793}">
   <ds:schemaRefs>
     <ds:schemaRef ds:uri="http://schemas.openxmlformats.org/officeDocument/2006/bibliography"/>
   </ds:schemaRefs>

</xml_diff>